<commit_message>
Consolidate platform updates across API, ingestion, frontend, docs, and exports while stabilizing Python runtime selection and type safety.
This keeps the branch consistent with green lint, typecheck, tests, validation, golden-path guard, and dashboard generation before sync.

Made-with: Cursor
</commit_message>
<xml_diff>
--- a/docs/exports/project-architecture-execution-guide.docx
+++ b/docs/exports/project-architecture-execution-guide.docx
@@ -3325,12 +3325,745 @@
         <w:pStyle w:val="Heading1"/>
       </w:pPr>
       <w:r>
-        <w:t>13. Summary</w:t>
-      </w:r>
-    </w:p>
-    <w:p>
-      <w:r>
-        <w:t>The platform is intended to become a continuously running market-ingestion and property-grouping system.</w:t>
+        <w:t>13. Business Model &amp; Market Analysis</w:t>
+      </w:r>
+    </w:p>
+    <w:p>
+      <w:r>
+        <w:t>Full unit economics and market analysis: `docs/business/unit-economics-market-analysis.md`</w:t>
+      </w:r>
+    </w:p>
+    <w:p>
+      <w:r>
+        <w:t>Investor presentation with charts: `output/pdf/investor-presentation-{date}.pdf`</w:t>
+      </w:r>
+    </w:p>
+    <w:p>
+      <w:pPr>
+        <w:pStyle w:val="Heading2"/>
+      </w:pPr>
+      <w:r>
+        <w:t>13.1 TAM / SAM / SOM</w:t>
+      </w:r>
+    </w:p>
+    <w:tbl>
+      <w:tblPr>
+        <w:tblStyle w:val="TableGrid"/>
+        <w:tblW w:type="auto" w:w="0"/>
+        <w:jc w:val="left"/>
+        <w:tblLook w:firstColumn="1" w:firstRow="1" w:lastColumn="0" w:lastRow="0" w:noHBand="0" w:noVBand="1" w:val="04A0"/>
+      </w:tblPr>
+      <w:tblGrid>
+        <w:gridCol w:w="2880"/>
+        <w:gridCol w:w="2880"/>
+        <w:gridCol w:w="2880"/>
+      </w:tblGrid>
+      <w:tr>
+        <w:tc>
+          <w:tcPr>
+            <w:tcW w:type="dxa" w:w="2880"/>
+          </w:tcPr>
+          <w:p>
+            <w:r>
+              <w:rPr>
+                <w:b/>
+              </w:rPr>
+              <w:t>Level</w:t>
+            </w:r>
+          </w:p>
+        </w:tc>
+        <w:tc>
+          <w:tcPr>
+            <w:tcW w:type="dxa" w:w="2880"/>
+          </w:tcPr>
+          <w:p>
+            <w:r>
+              <w:rPr>
+                <w:b/>
+              </w:rPr>
+              <w:t>Annual Revenue</w:t>
+            </w:r>
+          </w:p>
+        </w:tc>
+        <w:tc>
+          <w:tcPr>
+            <w:tcW w:type="dxa" w:w="2880"/>
+          </w:tcPr>
+          <w:p>
+            <w:r>
+              <w:rPr>
+                <w:b/>
+              </w:rPr>
+              <w:t>Basis</w:t>
+            </w:r>
+          </w:p>
+        </w:tc>
+      </w:tr>
+      <w:tr>
+        <w:tc>
+          <w:tcPr>
+            <w:tcW w:type="dxa" w:w="2880"/>
+          </w:tcPr>
+          <w:p>
+            <w:r>
+              <w:t>TAM (Bulgaria)</w:t>
+            </w:r>
+          </w:p>
+        </w:tc>
+        <w:tc>
+          <w:tcPr>
+            <w:tcW w:type="dxa" w:w="2880"/>
+          </w:tcPr>
+          <w:p>
+            <w:r>
+              <w:t>€74.7M</w:t>
+            </w:r>
+          </w:p>
+        </w:tc>
+        <w:tc>
+          <w:tcPr>
+            <w:tcW w:type="dxa" w:w="2880"/>
+          </w:tcPr>
+          <w:p>
+            <w:r>
+              <w:t>Agency subs + listing fees + leads + STR + AI + developer marketing</w:t>
+            </w:r>
+          </w:p>
+        </w:tc>
+      </w:tr>
+      <w:tr>
+        <w:tc>
+          <w:tcPr>
+            <w:tcW w:type="dxa" w:w="2880"/>
+          </w:tcPr>
+          <w:p>
+            <w:r>
+              <w:t>SAM (coastal)</w:t>
+            </w:r>
+          </w:p>
+        </w:tc>
+        <w:tc>
+          <w:tcPr>
+            <w:tcW w:type="dxa" w:w="2880"/>
+          </w:tcPr>
+          <w:p>
+            <w:r>
+              <w:t>€22.6M</w:t>
+            </w:r>
+          </w:p>
+        </w:tc>
+        <w:tc>
+          <w:tcPr>
+            <w:tcW w:type="dxa" w:w="2880"/>
+          </w:tcPr>
+          <w:p>
+            <w:r>
+              <w:t>28–35% coastal share</w:t>
+            </w:r>
+          </w:p>
+        </w:tc>
+      </w:tr>
+      <w:tr>
+        <w:tc>
+          <w:tcPr>
+            <w:tcW w:type="dxa" w:w="2880"/>
+          </w:tcPr>
+          <w:p>
+            <w:r>
+              <w:t>SOM Year 1</w:t>
+            </w:r>
+          </w:p>
+        </w:tc>
+        <w:tc>
+          <w:tcPr>
+            <w:tcW w:type="dxa" w:w="2880"/>
+          </w:tcPr>
+          <w:p>
+            <w:r>
+              <w:t>€0.7–1.1M</w:t>
+            </w:r>
+          </w:p>
+        </w:tc>
+        <w:tc>
+          <w:tcPr>
+            <w:tcW w:type="dxa" w:w="2880"/>
+          </w:tcPr>
+          <w:p>
+            <w:r>
+              <w:t>Varna MVP, 50 agency subs</w:t>
+            </w:r>
+          </w:p>
+        </w:tc>
+      </w:tr>
+      <w:tr>
+        <w:tc>
+          <w:tcPr>
+            <w:tcW w:type="dxa" w:w="2880"/>
+          </w:tcPr>
+          <w:p>
+            <w:r>
+              <w:t>SOM Year 3</w:t>
+            </w:r>
+          </w:p>
+        </w:tc>
+        <w:tc>
+          <w:tcPr>
+            <w:tcW w:type="dxa" w:w="2880"/>
+          </w:tcPr>
+          <w:p>
+            <w:r>
+              <w:t>€4.5–6.8M</w:t>
+            </w:r>
+          </w:p>
+        </w:tc>
+        <w:tc>
+          <w:tcPr>
+            <w:tcW w:type="dxa" w:w="2880"/>
+          </w:tcPr>
+          <w:p>
+            <w:r>
+              <w:t>Multi-city, 20–30% share</w:t>
+            </w:r>
+          </w:p>
+        </w:tc>
+      </w:tr>
+    </w:tbl>
+    <w:p/>
+    <w:p>
+      <w:pPr>
+        <w:pStyle w:val="Heading2"/>
+      </w:pPr>
+      <w:r>
+        <w:t>13.2 Platform positioning</w:t>
+      </w:r>
+    </w:p>
+    <w:p>
+      <w:r>
+        <w:t>Buyer-oriented marketplace. Owners post directly. Agents are "owner representatives". 30+ sources aggregated with AI dedupe, 3D map (Varna MVP), and persistent AI chat.</w:t>
+      </w:r>
+    </w:p>
+    <w:p>
+      <w:r>
+        <w:t>Key differentiator: No existing Bulgarian portal aggregates across sources. Our platform is the first unified search with 95%+ supply coverage.</w:t>
+      </w:r>
+    </w:p>
+    <w:p>
+      <w:pPr>
+        <w:pStyle w:val="Heading2"/>
+      </w:pPr>
+      <w:r>
+        <w:t>13.3 Go-to-market phases</w:t>
+      </w:r>
+    </w:p>
+    <w:tbl>
+      <w:tblPr>
+        <w:tblStyle w:val="TableGrid"/>
+        <w:tblW w:type="auto" w:w="0"/>
+        <w:jc w:val="left"/>
+        <w:tblLook w:firstColumn="1" w:firstRow="1" w:lastColumn="0" w:lastRow="0" w:noHBand="0" w:noVBand="1" w:val="04A0"/>
+      </w:tblPr>
+      <w:tblGrid>
+        <w:gridCol w:w="2160"/>
+        <w:gridCol w:w="2160"/>
+        <w:gridCol w:w="2160"/>
+        <w:gridCol w:w="2160"/>
+      </w:tblGrid>
+      <w:tr>
+        <w:tc>
+          <w:tcPr>
+            <w:tcW w:type="dxa" w:w="2160"/>
+          </w:tcPr>
+          <w:p>
+            <w:r>
+              <w:rPr>
+                <w:b/>
+              </w:rPr>
+              <w:t>Phase</w:t>
+            </w:r>
+          </w:p>
+        </w:tc>
+        <w:tc>
+          <w:tcPr>
+            <w:tcW w:type="dxa" w:w="2160"/>
+          </w:tcPr>
+          <w:p>
+            <w:r>
+              <w:rPr>
+                <w:b/>
+              </w:rPr>
+              <w:t>Timeline</w:t>
+            </w:r>
+          </w:p>
+        </w:tc>
+        <w:tc>
+          <w:tcPr>
+            <w:tcW w:type="dxa" w:w="2160"/>
+          </w:tcPr>
+          <w:p>
+            <w:r>
+              <w:rPr>
+                <w:b/>
+              </w:rPr>
+              <w:t>Scope</w:t>
+            </w:r>
+          </w:p>
+        </w:tc>
+        <w:tc>
+          <w:tcPr>
+            <w:tcW w:type="dxa" w:w="2160"/>
+          </w:tcPr>
+          <w:p>
+            <w:r>
+              <w:rPr>
+                <w:b/>
+              </w:rPr>
+              <w:t>Target</w:t>
+            </w:r>
+          </w:p>
+        </w:tc>
+      </w:tr>
+      <w:tr>
+        <w:tc>
+          <w:tcPr>
+            <w:tcW w:type="dxa" w:w="2160"/>
+          </w:tcPr>
+          <w:p>
+            <w:r>
+              <w:t>MVP</w:t>
+            </w:r>
+          </w:p>
+        </w:tc>
+        <w:tc>
+          <w:tcPr>
+            <w:tcW w:type="dxa" w:w="2160"/>
+          </w:tcPr>
+          <w:p>
+            <w:r>
+              <w:t>Months 1–4</w:t>
+            </w:r>
+          </w:p>
+        </w:tc>
+        <w:tc>
+          <w:tcPr>
+            <w:tcW w:type="dxa" w:w="2160"/>
+          </w:tcPr>
+          <w:p>
+            <w:r>
+              <w:t>Varna, 10 tier-1 sources, 3D map, AI chat</w:t>
+            </w:r>
+          </w:p>
+        </w:tc>
+        <w:tc>
+          <w:tcPr>
+            <w:tcW w:type="dxa" w:w="2160"/>
+          </w:tcPr>
+          <w:p>
+            <w:r>
+              <w:t>5K MAU, 50 agencies</w:t>
+            </w:r>
+          </w:p>
+        </w:tc>
+      </w:tr>
+      <w:tr>
+        <w:tc>
+          <w:tcPr>
+            <w:tcW w:type="dxa" w:w="2160"/>
+          </w:tcPr>
+          <w:p>
+            <w:r>
+              <w:t>Coastal</w:t>
+            </w:r>
+          </w:p>
+        </w:tc>
+        <w:tc>
+          <w:tcPr>
+            <w:tcW w:type="dxa" w:w="2160"/>
+          </w:tcPr>
+          <w:p>
+            <w:r>
+              <w:t>Months 5–8</w:t>
+            </w:r>
+          </w:p>
+        </w:tc>
+        <w:tc>
+          <w:tcPr>
+            <w:tcW w:type="dxa" w:w="2160"/>
+          </w:tcPr>
+          <w:p>
+            <w:r>
+              <w:t>Burgas + resorts, 25+ sources, STR analytics</w:t>
+            </w:r>
+          </w:p>
+        </w:tc>
+        <w:tc>
+          <w:tcPr>
+            <w:tcW w:type="dxa" w:w="2160"/>
+          </w:tcPr>
+          <w:p>
+            <w:r>
+              <w:t>15K MAU, 200 agencies</w:t>
+            </w:r>
+          </w:p>
+        </w:tc>
+      </w:tr>
+      <w:tr>
+        <w:tc>
+          <w:tcPr>
+            <w:tcW w:type="dxa" w:w="2160"/>
+          </w:tcPr>
+          <w:p>
+            <w:r>
+              <w:t>National</w:t>
+            </w:r>
+          </w:p>
+        </w:tc>
+        <w:tc>
+          <w:tcPr>
+            <w:tcW w:type="dxa" w:w="2160"/>
+          </w:tcPr>
+          <w:p>
+            <w:r>
+              <w:t>Months 9–14</w:t>
+            </w:r>
+          </w:p>
+        </w:tc>
+        <w:tc>
+          <w:tcPr>
+            <w:tcW w:type="dxa" w:w="2160"/>
+          </w:tcPr>
+          <w:p>
+            <w:r>
+              <w:t>Sofia/Plovdiv/Bansko, CRM, publishing</w:t>
+            </w:r>
+          </w:p>
+        </w:tc>
+        <w:tc>
+          <w:tcPr>
+            <w:tcW w:type="dxa" w:w="2160"/>
+          </w:tcPr>
+          <w:p>
+            <w:r>
+              <w:t>50K MAU, 500 agencies</w:t>
+            </w:r>
+          </w:p>
+        </w:tc>
+      </w:tr>
+      <w:tr>
+        <w:tc>
+          <w:tcPr>
+            <w:tcW w:type="dxa" w:w="2160"/>
+          </w:tcPr>
+          <w:p>
+            <w:r>
+              <w:t>International</w:t>
+            </w:r>
+          </w:p>
+        </w:tc>
+        <w:tc>
+          <w:tcPr>
+            <w:tcW w:type="dxa" w:w="2160"/>
+          </w:tcPr>
+          <w:p>
+            <w:r>
+              <w:t>Months 15–24</w:t>
+            </w:r>
+          </w:p>
+        </w:tc>
+        <w:tc>
+          <w:tcPr>
+            <w:tcW w:type="dxa" w:w="2160"/>
+          </w:tcPr>
+          <w:p>
+            <w:r>
+              <w:t>EU buyer funnel, multi-lang, cross-border tools</w:t>
+            </w:r>
+          </w:p>
+        </w:tc>
+        <w:tc>
+          <w:tcPr>
+            <w:tcW w:type="dxa" w:w="2160"/>
+          </w:tcPr>
+          <w:p>
+            <w:r>
+              <w:t>100K MAU, leader</w:t>
+            </w:r>
+          </w:p>
+        </w:tc>
+      </w:tr>
+    </w:tbl>
+    <w:p/>
+    <w:p>
+      <w:pPr>
+        <w:pStyle w:val="Heading1"/>
+      </w:pPr>
+      <w:r>
+        <w:t>14. 3D Map Integration (Varna MVP)</w:t>
+      </w:r>
+    </w:p>
+    <w:p>
+      <w:r>
+        <w:t>Full integration plan: `docs/business/varna-3d-osm-integration.md`</w:t>
+      </w:r>
+    </w:p>
+    <w:p>
+      <w:r>
+        <w:t>Technology: MapLibre GL JS + deck.gl 3D building extrusion. Data: OpenStreetMap (GeoFabrik extract → osmium → tippecanoe → PMTiles).</w:t>
+      </w:r>
+    </w:p>
+    <w:tbl>
+      <w:tblPr>
+        <w:tblStyle w:val="TableGrid"/>
+        <w:tblW w:type="auto" w:w="0"/>
+        <w:jc w:val="left"/>
+        <w:tblLook w:firstColumn="1" w:firstRow="1" w:lastColumn="0" w:lastRow="0" w:noHBand="0" w:noVBand="1" w:val="04A0"/>
+      </w:tblPr>
+      <w:tblGrid>
+        <w:gridCol w:w="2880"/>
+        <w:gridCol w:w="2880"/>
+        <w:gridCol w:w="2880"/>
+      </w:tblGrid>
+      <w:tr>
+        <w:tc>
+          <w:tcPr>
+            <w:tcW w:type="dxa" w:w="2880"/>
+          </w:tcPr>
+          <w:p>
+            <w:r>
+              <w:rPr>
+                <w:b/>
+              </w:rPr>
+              <w:t>Component</w:t>
+            </w:r>
+          </w:p>
+        </w:tc>
+        <w:tc>
+          <w:tcPr>
+            <w:tcW w:type="dxa" w:w="2880"/>
+          </w:tcPr>
+          <w:p>
+            <w:r>
+              <w:rPr>
+                <w:b/>
+              </w:rPr>
+              <w:t>Owner</w:t>
+            </w:r>
+          </w:p>
+        </w:tc>
+        <w:tc>
+          <w:tcPr>
+            <w:tcW w:type="dxa" w:w="2880"/>
+          </w:tcPr>
+          <w:p>
+            <w:r>
+              <w:rPr>
+                <w:b/>
+              </w:rPr>
+              <w:t>Status</w:t>
+            </w:r>
+          </w:p>
+        </w:tc>
+      </w:tr>
+      <w:tr>
+        <w:tc>
+          <w:tcPr>
+            <w:tcW w:type="dxa" w:w="2880"/>
+          </w:tcPr>
+          <w:p>
+            <w:r>
+              <w:t>OSM data pipeline</w:t>
+            </w:r>
+          </w:p>
+        </w:tc>
+        <w:tc>
+          <w:tcPr>
+            <w:tcW w:type="dxa" w:w="2880"/>
+          </w:tcPr>
+          <w:p>
+            <w:r>
+              <w:t>backend_developer (BD-08)</w:t>
+            </w:r>
+          </w:p>
+        </w:tc>
+        <w:tc>
+          <w:tcPr>
+            <w:tcW w:type="dxa" w:w="2880"/>
+          </w:tcPr>
+          <w:p>
+            <w:r>
+              <w:t>TODO</w:t>
+            </w:r>
+          </w:p>
+        </w:tc>
+      </w:tr>
+      <w:tr>
+        <w:tc>
+          <w:tcPr>
+            <w:tcW w:type="dxa" w:w="2880"/>
+          </w:tcPr>
+          <w:p>
+            <w:r>
+              <w:t>PostGIS building_entity</w:t>
+            </w:r>
+          </w:p>
+        </w:tc>
+        <w:tc>
+          <w:tcPr>
+            <w:tcW w:type="dxa" w:w="2880"/>
+          </w:tcPr>
+          <w:p>
+            <w:r>
+              <w:t>backend_developer</w:t>
+            </w:r>
+          </w:p>
+        </w:tc>
+        <w:tc>
+          <w:tcPr>
+            <w:tcW w:type="dxa" w:w="2880"/>
+          </w:tcPr>
+          <w:p>
+            <w:r>
+              <w:t>Schema exists</w:t>
+            </w:r>
+          </w:p>
+        </w:tc>
+      </w:tr>
+      <w:tr>
+        <w:tc>
+          <w:tcPr>
+            <w:tcW w:type="dxa" w:w="2880"/>
+          </w:tcPr>
+          <w:p>
+            <w:r>
+              <w:t>MapLibre 3D layer</w:t>
+            </w:r>
+          </w:p>
+        </w:tc>
+        <w:tc>
+          <w:tcPr>
+            <w:tcW w:type="dxa" w:w="2880"/>
+          </w:tcPr>
+          <w:p>
+            <w:r>
+              <w:t>ux_ui_designer (UX-07)</w:t>
+            </w:r>
+          </w:p>
+        </w:tc>
+        <w:tc>
+          <w:tcPr>
+            <w:tcW w:type="dxa" w:w="2880"/>
+          </w:tcPr>
+          <w:p>
+            <w:r>
+              <w:t>TODO</w:t>
+            </w:r>
+          </w:p>
+        </w:tc>
+      </w:tr>
+      <w:tr>
+        <w:tc>
+          <w:tcPr>
+            <w:tcW w:type="dxa" w:w="2880"/>
+          </w:tcPr>
+          <w:p>
+            <w:r>
+              <w:t>PMTiles static serving</w:t>
+            </w:r>
+          </w:p>
+        </w:tc>
+        <w:tc>
+          <w:tcPr>
+            <w:tcW w:type="dxa" w:w="2880"/>
+          </w:tcPr>
+          <w:p>
+            <w:r>
+              <w:t>backend_developer</w:t>
+            </w:r>
+          </w:p>
+        </w:tc>
+        <w:tc>
+          <w:tcPr>
+            <w:tcW w:type="dxa" w:w="2880"/>
+          </w:tcPr>
+          <w:p>
+            <w:r>
+              <w:t>TODO</w:t>
+            </w:r>
+          </w:p>
+        </w:tc>
+      </w:tr>
+      <w:tr>
+        <w:tc>
+          <w:tcPr>
+            <w:tcW w:type="dxa" w:w="2880"/>
+          </w:tcPr>
+          <w:p>
+            <w:r>
+              <w:t>Blosm marketing renders</w:t>
+            </w:r>
+          </w:p>
+        </w:tc>
+        <w:tc>
+          <w:tcPr>
+            <w:tcW w:type="dxa" w:w="2880"/>
+          </w:tcPr>
+          <w:p>
+            <w:r>
+              <w:t>ux_ui_designer (optional)</w:t>
+            </w:r>
+          </w:p>
+        </w:tc>
+        <w:tc>
+          <w:tcPr>
+            <w:tcW w:type="dxa" w:w="2880"/>
+          </w:tcPr>
+          <w:p>
+            <w:r>
+              <w:t>Deferred</w:t>
+            </w:r>
+          </w:p>
+        </w:tc>
+      </w:tr>
+    </w:tbl>
+    <w:p/>
+    <w:p>
+      <w:r>
+        <w:t>Blosm (https://github.com/vvoovv/blosm) generates beautiful offline 3D renders for marketing. MapLibre handles runtime web rendering.</w:t>
+      </w:r>
+    </w:p>
+    <w:p>
+      <w:pPr>
+        <w:pStyle w:val="Heading1"/>
+      </w:pPr>
+      <w:r>
+        <w:t>15. Product UX Structure</w:t>
+      </w:r>
+    </w:p>
+    <w:p>
+      <w:r>
+        <w:t>Full spec: `docs/business/product-ux-structure.md`</w:t>
+      </w:r>
+    </w:p>
+    <w:p>
+      <w:r>
+        <w:t>Core pages: `/` (map+feed split), `/properties/[id]`, `/map` (fullscreen 3D), `/chat` (AI assistant), `/new-builds`, `/analytics`, `/post` (owner submission), `/admin`.</w:t>
+      </w:r>
+    </w:p>
+    <w:p>
+      <w:r>
+        <w:t>Reference model: LUN.ua (Ukraine aggregator) adapted for Bulgaria with AI chat, 3D buildings, owner-first posting.</w:t>
+      </w:r>
+    </w:p>
+    <w:p>
+      <w:pPr>
+        <w:pStyle w:val="Heading1"/>
+      </w:pPr>
+      <w:r>
+        <w:t>16. Summary</w:t>
+      </w:r>
+    </w:p>
+    <w:p>
+      <w:r>
+        <w:t>The platform is intended to become a continuously running market-ingestion and property-grouping system with a buyer-oriented marketplace frontend.</w:t>
       </w:r>
     </w:p>
     <w:p>
@@ -3343,7 +4076,7 @@
         <w:pStyle w:val="ListNumber"/>
       </w:pPr>
       <w:r>
-        <w:t>scrape continuously</w:t>
+        <w:t>scrape continuously from 30+ sources</w:t>
       </w:r>
     </w:p>
     <w:p>
@@ -3384,6 +4117,38 @@
       </w:pPr>
       <w:r>
         <w:t>build product views on top of the grouped property graph</w:t>
+      </w:r>
+    </w:p>
+    <w:p>
+      <w:pPr>
+        <w:pStyle w:val="ListNumber"/>
+      </w:pPr>
+      <w:r>
+        <w:t>render 3D map with OSM buildings for Varna city</w:t>
+      </w:r>
+    </w:p>
+    <w:p>
+      <w:pPr>
+        <w:pStyle w:val="ListNumber"/>
+      </w:pPr>
+      <w:r>
+        <w:t>provide AI chat assistant aware of property context and map state</w:t>
+      </w:r>
+    </w:p>
+    <w:p>
+      <w:pPr>
+        <w:pStyle w:val="ListNumber"/>
+      </w:pPr>
+      <w:r>
+        <w:t>enable owner-first posting with agent-as-representative model</w:t>
+      </w:r>
+    </w:p>
+    <w:p>
+      <w:pPr>
+        <w:pStyle w:val="ListNumber"/>
+      </w:pPr>
+      <w:r>
+        <w:t>capture revenue through agency subs, premium listings, leads, STR analytics</w:t>
       </w:r>
     </w:p>
     <w:sectPr>

</xml_diff>

<commit_message>
Prepare infra DB migration readiness and execution handoff
</commit_message>
<xml_diff>
--- a/docs/exports/project-architecture-execution-guide.docx
+++ b/docs/exports/project-architecture-execution-guide.docx
@@ -12,7 +12,7 @@
     </w:p>
     <w:p>
       <w:r>
-        <w:t>Updated: 2026-04-29</w:t>
+        <w:t>Updated: 2026-04-28</w:t>
       </w:r>
     </w:p>
     <w:p>
@@ -330,36 +330,7 @@
     </w:p>
     <w:p>
       <w:r>
-        <w:t>Gemma4/OpenClaw must follow the current sequence:</w:t>
-      </w:r>
-    </w:p>
-    <w:p>
-      <w:pPr>
-        <w:pStyle w:val="ListNumber"/>
-      </w:pPr>
-      <w:r>
-        <w:t>**Action0**: consume `docs/exports/s1-21-gemma-action0-eligible.json`, local listing JSON, and local image files, then produce per-property image descriptions and QA reports.</w:t>
-      </w:r>
-    </w:p>
-    <w:p>
-      <w:pPr>
-        <w:pStyle w:val="ListNumber"/>
-      </w:pPr>
-      <w:r>
-        <w:t>**Action1**: under operator-approved live runtime, scrape/backfill `Address.bg`, `BulgarianProperties`, `Homes.bg`, `imot.bg`, `LUXIMMO`, `property.bg`, and `SUPRIMMO` across all four buckets.</w:t>
-      </w:r>
-    </w:p>
-    <w:p>
-      <w:pPr>
-        <w:pStyle w:val="ListNumber"/>
-      </w:pPr>
-      <w:r>
-        <w:t>**Action2**: after Action1 QA, continue the same workflow for remaining legal tier-1/2 sources.</w:t>
-      </w:r>
-    </w:p>
-    <w:p>
-      <w:r>
-        <w:t>Use `docs/exports/taskforgema.md`, `docs/exports/s1-21-tier12-quality-audit-2026-04-29.md`, and `docs/exports/property-quality-and-building-contract.md` as the authoritative handoff.</w:t>
+        <w:t>Gemma4/OpenClaw must consume only local listing JSON and local image files, then produce per-property image descriptions and QA reports using `docs/exports/taskforgema.md` and `docs/exports/property-quality-and-building-contract.md`.</w:t>
       </w:r>
     </w:p>
     <w:p>

</xml_diff>